<commit_message>
work on final papers
conitnued work on UE final paper. Progress on methodology + EZ maps
</commit_message>
<xml_diff>
--- a/file_transit/ReflectionPaper.docx
+++ b/file_transit/ReflectionPaper.docx
@@ -1031,7 +1031,75 @@
         <w:rPr>
           <w:rFonts w:ascii="Times New Roman" w:eastAsiaTheme="minorEastAsia" w:hAnsi="Times New Roman" w:cs="Times New Roman"/>
         </w:rPr>
-        <w:t xml:space="preserve">parameters </w:t>
+        <w:t>parameters</w:t>
+      </w:r>
+      <w:r>
+        <w:rPr>
+          <w:rFonts w:ascii="Times New Roman" w:eastAsiaTheme="minorEastAsia" w:hAnsi="Times New Roman" w:cs="Times New Roman"/>
+        </w:rPr>
+        <w:t xml:space="preserve"> </w:t>
+      </w:r>
+      <m:oMath>
+        <m:r>
+          <w:rPr>
+            <w:rFonts w:ascii="Cambria Math" w:eastAsiaTheme="minorEastAsia" w:hAnsi="Cambria Math" w:cs="Times New Roman"/>
+          </w:rPr>
+          <m:t>T</m:t>
+        </m:r>
+      </m:oMath>
+      <w:r>
+        <w:rPr>
+          <w:rFonts w:ascii="Times New Roman" w:eastAsiaTheme="minorEastAsia" w:hAnsi="Times New Roman" w:cs="Times New Roman"/>
+        </w:rPr>
+        <w:t xml:space="preserve">, </w:t>
+      </w:r>
+      <m:oMath>
+        <m:r>
+          <w:rPr>
+            <w:rFonts w:ascii="Cambria Math" w:eastAsiaTheme="minorEastAsia" w:hAnsi="Cambria Math" w:cs="Times New Roman"/>
+          </w:rPr>
+          <m:t>δ</m:t>
+        </m:r>
+      </m:oMath>
+      <w:r>
+        <w:rPr>
+          <w:rFonts w:ascii="Times New Roman" w:eastAsiaTheme="minorEastAsia" w:hAnsi="Times New Roman" w:cs="Times New Roman"/>
+        </w:rPr>
+        <w:t xml:space="preserve">, </w:t>
+      </w:r>
+      <m:oMath>
+        <m:sSub>
+          <m:sSubPr>
+            <m:ctrlPr>
+              <w:rPr>
+                <w:rFonts w:ascii="Cambria Math" w:hAnsi="Cambria Math" w:cs="Times New Roman"/>
+                <w:i/>
+              </w:rPr>
+            </m:ctrlPr>
+          </m:sSubPr>
+          <m:e>
+            <m:r>
+              <w:rPr>
+                <w:rFonts w:ascii="Cambria Math" w:hAnsi="Cambria Math" w:cs="Times New Roman"/>
+              </w:rPr>
+              <m:t>θ</m:t>
+            </m:r>
+          </m:e>
+          <m:sub>
+            <m:r>
+              <w:rPr>
+                <w:rFonts w:ascii="Cambria Math" w:hAnsi="Cambria Math" w:cs="Times New Roman"/>
+              </w:rPr>
+              <m:t>k</m:t>
+            </m:r>
+          </m:sub>
+        </m:sSub>
+      </m:oMath>
+      <w:r>
+        <w:rPr>
+          <w:rFonts w:ascii="Times New Roman" w:eastAsiaTheme="minorEastAsia" w:hAnsi="Times New Roman" w:cs="Times New Roman"/>
+        </w:rPr>
+        <w:t xml:space="preserve">, and </w:t>
       </w:r>
       <m:oMath>
         <m:sSub>
@@ -1063,49 +1131,33 @@
       </m:oMath>
       <w:r>
         <w:rPr>
-          <w:rFonts w:ascii="Times New Roman" w:hAnsi="Times New Roman" w:cs="Times New Roman"/>
-        </w:rPr>
-        <w:t>,</w:t>
-      </w:r>
-      <w:r>
-        <w:rPr>
-          <w:rFonts w:ascii="Times New Roman" w:hAnsi="Times New Roman" w:cs="Times New Roman"/>
-        </w:rPr>
-        <w:t xml:space="preserve"> </w:t>
-      </w:r>
-      <m:oMath>
-        <m:sSub>
-          <m:sSubPr>
-            <m:ctrlPr>
-              <w:rPr>
-                <w:rFonts w:ascii="Cambria Math" w:hAnsi="Cambria Math" w:cs="Times New Roman"/>
-                <w:i/>
-              </w:rPr>
-            </m:ctrlPr>
-          </m:sSubPr>
-          <m:e>
-            <m:r>
-              <w:rPr>
-                <w:rFonts w:ascii="Cambria Math" w:hAnsi="Cambria Math" w:cs="Times New Roman"/>
-              </w:rPr>
-              <m:t>θ</m:t>
-            </m:r>
-          </m:e>
-          <m:sub>
-            <m:r>
-              <w:rPr>
-                <w:rFonts w:ascii="Cambria Math" w:hAnsi="Cambria Math" w:cs="Times New Roman"/>
-              </w:rPr>
-              <m:t>k</m:t>
-            </m:r>
-          </m:sub>
-        </m:sSub>
-      </m:oMath>
-      <w:r>
-        <w:rPr>
-          <w:rFonts w:ascii="Times New Roman" w:eastAsiaTheme="minorEastAsia" w:hAnsi="Times New Roman" w:cs="Times New Roman"/>
-        </w:rPr>
-        <w:t xml:space="preserve">, and </w:t>
+          <w:rFonts w:ascii="Times New Roman" w:eastAsiaTheme="minorEastAsia" w:hAnsi="Times New Roman" w:cs="Times New Roman"/>
+        </w:rPr>
+        <w:t xml:space="preserve">. </w:t>
+      </w:r>
+      <w:r>
+        <w:rPr>
+          <w:rFonts w:ascii="Times New Roman" w:eastAsiaTheme="minorEastAsia" w:hAnsi="Times New Roman" w:cs="Times New Roman"/>
+        </w:rPr>
+        <w:t xml:space="preserve">Donaldson strategically measures alternate modes of trade (road, river, coast) in terms of ‘rail distance’. </w:t>
+      </w:r>
+      <w:r>
+        <w:rPr>
+          <w:rFonts w:ascii="Times New Roman" w:eastAsiaTheme="minorEastAsia" w:hAnsi="Times New Roman" w:cs="Times New Roman"/>
+        </w:rPr>
+        <w:t xml:space="preserve">These distances act as weights in the transportation network, grounded in historical freight rate data </w:t>
+      </w:r>
+      <w:r>
+        <w:rPr>
+          <w:rFonts w:ascii="Times New Roman" w:eastAsiaTheme="minorEastAsia" w:hAnsi="Times New Roman" w:cs="Times New Roman"/>
+        </w:rPr>
+        <w:t>and estimated through NLS</w:t>
+      </w:r>
+      <w:r>
+        <w:rPr>
+          <w:rFonts w:ascii="Times New Roman" w:eastAsiaTheme="minorEastAsia" w:hAnsi="Times New Roman" w:cs="Times New Roman"/>
+        </w:rPr>
+        <w:t xml:space="preserve"> to produce </w:t>
       </w:r>
       <m:oMath>
         <m:r>
@@ -1119,31 +1171,375 @@
         <w:rPr>
           <w:rFonts w:ascii="Times New Roman" w:eastAsiaTheme="minorEastAsia" w:hAnsi="Times New Roman" w:cs="Times New Roman"/>
         </w:rPr>
+        <w:t xml:space="preserve">, the bilateral trade cost between districts. </w:t>
+      </w:r>
+      <w:r>
+        <w:rPr>
+          <w:rFonts w:ascii="Times New Roman" w:eastAsiaTheme="minorEastAsia" w:hAnsi="Times New Roman" w:cs="Times New Roman"/>
+        </w:rPr>
+        <w:t>Additionally</w:t>
+      </w:r>
+      <w:r>
+        <w:rPr>
+          <w:rFonts w:ascii="Times New Roman" w:eastAsiaTheme="minorEastAsia" w:hAnsi="Times New Roman" w:cs="Times New Roman"/>
+        </w:rPr>
+        <w:t xml:space="preserve">, these weights </w:t>
+      </w:r>
+      <w:r>
+        <w:rPr>
+          <w:rFonts w:ascii="Times New Roman" w:eastAsiaTheme="minorEastAsia" w:hAnsi="Times New Roman" w:cs="Times New Roman"/>
+        </w:rPr>
+        <w:t>establish</w:t>
+      </w:r>
+      <w:r>
+        <w:rPr>
+          <w:rFonts w:ascii="Times New Roman" w:eastAsiaTheme="minorEastAsia" w:hAnsi="Times New Roman" w:cs="Times New Roman"/>
+        </w:rPr>
+        <w:t xml:space="preserve"> a credible counterfactual of what trade costs would have looked like across all modes in the absence of railroad expansion</w:t>
+      </w:r>
+      <w:r>
+        <w:rPr>
+          <w:rFonts w:ascii="Times New Roman" w:eastAsiaTheme="minorEastAsia" w:hAnsi="Times New Roman" w:cs="Times New Roman"/>
+        </w:rPr>
         <w:t xml:space="preserve">. </w:t>
       </w:r>
       <w:r>
         <w:rPr>
           <w:rFonts w:ascii="Times New Roman" w:eastAsiaTheme="minorEastAsia" w:hAnsi="Times New Roman" w:cs="Times New Roman"/>
         </w:rPr>
-        <w:t>Before modern irrigation, agricultural production and even t</w:t>
-      </w:r>
-      <w:r>
-        <w:rPr>
-          <w:rFonts w:ascii="Times New Roman" w:eastAsiaTheme="minorEastAsia" w:hAnsi="Times New Roman" w:cs="Times New Roman"/>
-        </w:rPr>
-        <w:t xml:space="preserve">he economy of colonial India was heavily tied to rainfall. </w:t>
-      </w:r>
-      <w:r>
-        <w:rPr>
-          <w:rFonts w:ascii="Times New Roman" w:eastAsiaTheme="minorEastAsia" w:hAnsi="Times New Roman" w:cs="Times New Roman"/>
-        </w:rPr>
-        <w:t xml:space="preserve">Therefore, </w:t>
-      </w:r>
-      <w:r>
-        <w:rPr>
-          <w:rFonts w:ascii="Times New Roman" w:eastAsiaTheme="minorEastAsia" w:hAnsi="Times New Roman" w:cs="Times New Roman"/>
-        </w:rPr>
-        <w:t xml:space="preserve">Donaldson uses rainfall as an exogenous instrument for </w:t>
+        <w:t>T</w:t>
+      </w:r>
+      <w:r>
+        <w:rPr>
+          <w:rFonts w:ascii="Times New Roman" w:eastAsiaTheme="minorEastAsia" w:hAnsi="Times New Roman" w:cs="Times New Roman"/>
+        </w:rPr>
+        <w:t xml:space="preserve">he output </w:t>
+      </w:r>
+      <w:r>
+        <w:rPr>
+          <w:rFonts w:ascii="Times New Roman" w:eastAsiaTheme="minorEastAsia" w:hAnsi="Times New Roman" w:cs="Times New Roman"/>
+        </w:rPr>
+        <w:t xml:space="preserve">of this network </w:t>
+      </w:r>
+      <w:r>
+        <w:rPr>
+          <w:rFonts w:ascii="Times New Roman" w:eastAsiaTheme="minorEastAsia" w:hAnsi="Times New Roman" w:cs="Times New Roman"/>
+        </w:rPr>
+        <w:t xml:space="preserve">is the Least Cost Route Effective Distance, LCRED, which expresses the cheapest route between any two districts in rail-equivalent kilometers. It is from variation in LCRED, driven by the opening of new railroad segments over time, that Donaldson estimates δ, the elasticity of trade costs with respect to effective distance. </w:t>
+      </w:r>
+      <w:r>
+        <w:rPr>
+          <w:rFonts w:ascii="Times New Roman" w:eastAsiaTheme="minorEastAsia" w:hAnsi="Times New Roman" w:cs="Times New Roman"/>
+        </w:rPr>
+        <w:t xml:space="preserve">To do so, </w:t>
+      </w:r>
+      <w:r>
+        <w:rPr>
+          <w:rFonts w:ascii="Times New Roman" w:eastAsiaTheme="minorEastAsia" w:hAnsi="Times New Roman" w:cs="Times New Roman"/>
+        </w:rPr>
+        <w:t>Donaldson exploits price differentials of salt, a homogenous good, whose uniform quality across districts ensures that observed price gaps reflect trade costs alone rather than quality differences or product differentiation.</w:t>
+      </w:r>
+      <w:r>
+        <w:rPr>
+          <w:rFonts w:ascii="Times New Roman" w:eastAsiaTheme="minorEastAsia" w:hAnsi="Times New Roman" w:cs="Times New Roman"/>
+        </w:rPr>
+        <w:t xml:space="preserve"> To </w:t>
+      </w:r>
+      <w:r>
+        <w:rPr>
+          <w:rFonts w:ascii="Times New Roman" w:eastAsiaTheme="minorEastAsia" w:hAnsi="Times New Roman" w:cs="Times New Roman"/>
+        </w:rPr>
+        <w:t>isolate</w:t>
+      </w:r>
+      <w:r>
+        <w:rPr>
+          <w:rFonts w:ascii="Times New Roman" w:eastAsiaTheme="minorEastAsia" w:hAnsi="Times New Roman" w:cs="Times New Roman"/>
+        </w:rPr>
+        <w:t xml:space="preserve"> </w:t>
+      </w:r>
+      <m:oMath>
+        <m:r>
+          <w:rPr>
+            <w:rFonts w:ascii="Cambria Math" w:eastAsiaTheme="minorEastAsia" w:hAnsi="Cambria Math" w:cs="Times New Roman"/>
+          </w:rPr>
+          <m:t>δ</m:t>
+        </m:r>
+      </m:oMath>
+      <w:r>
+        <w:rPr>
+          <w:rFonts w:ascii="Times New Roman" w:eastAsiaTheme="minorEastAsia" w:hAnsi="Times New Roman" w:cs="Times New Roman"/>
+        </w:rPr>
+        <w:t>,</w:t>
+      </w:r>
+      <w:r>
+        <w:rPr>
+          <w:rFonts w:ascii="Times New Roman" w:eastAsiaTheme="minorEastAsia" w:hAnsi="Times New Roman" w:cs="Times New Roman"/>
+        </w:rPr>
+        <w:t xml:space="preserve"> Donaldson regresses the value of exports of commodity k from one region to another on a pair of fixed-effects, a term to absorb the origin-year-commodity</w:t>
+      </w:r>
+      <w:r>
+        <w:rPr>
+          <w:rFonts w:ascii="Times New Roman" w:eastAsiaTheme="minorEastAsia" w:hAnsi="Times New Roman" w:cs="Times New Roman"/>
+        </w:rPr>
+        <w:t xml:space="preserve"> and destination-year-commodity variation.</w:t>
+      </w:r>
+    </w:p>
+    <w:p>
+      <w:pPr>
+        <w:ind w:firstLine="720"/>
+        <w:rPr>
+          <w:rFonts w:ascii="Times New Roman" w:eastAsiaTheme="minorEastAsia" w:hAnsi="Times New Roman" w:cs="Times New Roman"/>
+        </w:rPr>
+      </w:pPr>
+      <w:r>
+        <w:rPr>
+          <w:rFonts w:ascii="Times New Roman" w:eastAsiaTheme="minorEastAsia" w:hAnsi="Times New Roman" w:cs="Times New Roman"/>
+        </w:rPr>
+        <w:t xml:space="preserve">Armed with the estimate of </w:t>
+      </w:r>
+      <m:oMath>
+        <m:r>
+          <w:rPr>
+            <w:rFonts w:ascii="Cambria Math" w:eastAsiaTheme="minorEastAsia" w:hAnsi="Cambria Math" w:cs="Times New Roman"/>
+          </w:rPr>
+          <m:t>δ</m:t>
+        </m:r>
+      </m:oMath>
+      <w:r>
+        <w:rPr>
+          <w:rFonts w:ascii="Times New Roman" w:eastAsiaTheme="minorEastAsia" w:hAnsi="Times New Roman" w:cs="Times New Roman"/>
+        </w:rPr>
+        <w:t xml:space="preserve"> from Step </w:t>
+      </w:r>
+      <w:r>
+        <w:rPr>
+          <w:rFonts w:ascii="Times New Roman" w:eastAsiaTheme="minorEastAsia" w:hAnsi="Times New Roman" w:cs="Times New Roman"/>
+        </w:rPr>
+        <w:t xml:space="preserve">1, Donaldson estimates </w:t>
+      </w:r>
+      <m:oMath>
+        <m:sSub>
+          <m:sSubPr>
+            <m:ctrlPr>
+              <w:rPr>
+                <w:rFonts w:ascii="Cambria Math" w:eastAsiaTheme="minorEastAsia" w:hAnsi="Cambria Math" w:cs="Times New Roman"/>
+                <w:i/>
+              </w:rPr>
+            </m:ctrlPr>
+          </m:sSubPr>
+          <m:e>
+            <m:r>
+              <w:rPr>
+                <w:rFonts w:ascii="Cambria Math" w:eastAsiaTheme="minorEastAsia" w:hAnsi="Cambria Math" w:cs="Times New Roman"/>
+              </w:rPr>
+              <m:t>θ</m:t>
+            </m:r>
+          </m:e>
+          <m:sub>
+            <m:r>
+              <w:rPr>
+                <w:rFonts w:ascii="Cambria Math" w:eastAsiaTheme="minorEastAsia" w:hAnsi="Cambria Math" w:cs="Times New Roman"/>
+              </w:rPr>
+              <m:t>k</m:t>
+            </m:r>
+          </m:sub>
+        </m:sSub>
+      </m:oMath>
+      <w:r>
+        <w:rPr>
+          <w:rFonts w:ascii="Times New Roman" w:eastAsiaTheme="minorEastAsia" w:hAnsi="Times New Roman" w:cs="Times New Roman"/>
+        </w:rPr>
+        <w:t xml:space="preserve"> </w:t>
+      </w:r>
+      <w:r>
+        <w:rPr>
+          <w:rFonts w:ascii="Times New Roman" w:eastAsiaTheme="minorEastAsia" w:hAnsi="Times New Roman" w:cs="Times New Roman"/>
+        </w:rPr>
+        <w:t>th</w:t>
+      </w:r>
+      <w:r>
+        <w:rPr>
+          <w:rFonts w:ascii="Times New Roman" w:eastAsiaTheme="minorEastAsia" w:hAnsi="Times New Roman" w:cs="Times New Roman"/>
+        </w:rPr>
+        <w:t xml:space="preserve">rough </w:t>
+      </w:r>
+      <w:r>
+        <w:rPr>
+          <w:rFonts w:ascii="Times New Roman" w:eastAsiaTheme="minorEastAsia" w:hAnsi="Times New Roman" w:cs="Times New Roman"/>
+        </w:rPr>
+        <w:t xml:space="preserve">the </w:t>
+      </w:r>
+      <w:r>
+        <w:rPr>
+          <w:rFonts w:ascii="Times New Roman" w:eastAsiaTheme="minorEastAsia" w:hAnsi="Times New Roman" w:cs="Times New Roman"/>
+        </w:rPr>
+        <w:t>gravity equation</w:t>
+      </w:r>
+      <w:r>
+        <w:rPr>
+          <w:rFonts w:ascii="Times New Roman" w:eastAsiaTheme="minorEastAsia" w:hAnsi="Times New Roman" w:cs="Times New Roman"/>
+        </w:rPr>
+        <w:t xml:space="preserve">, </w:t>
+      </w:r>
+      <w:r>
+        <w:rPr>
+          <w:rFonts w:ascii="Times New Roman" w:eastAsiaTheme="minorEastAsia" w:hAnsi="Times New Roman" w:cs="Times New Roman"/>
+        </w:rPr>
+        <w:t>a standard model in trade economics that relates bilateral trade flows to the size of trading partners and the distance between them</w:t>
+      </w:r>
+      <w:r>
+        <w:rPr>
+          <w:rFonts w:ascii="Times New Roman" w:eastAsiaTheme="minorEastAsia" w:hAnsi="Times New Roman" w:cs="Times New Roman"/>
+        </w:rPr>
+        <w:t>.</w:t>
+      </w:r>
+      <w:r>
+        <w:rPr>
+          <w:rFonts w:ascii="Times New Roman" w:eastAsiaTheme="minorEastAsia" w:hAnsi="Times New Roman" w:cs="Times New Roman"/>
+        </w:rPr>
+        <w:t xml:space="preserve"> U</w:t>
+      </w:r>
+      <w:r>
+        <w:rPr>
+          <w:rFonts w:ascii="Times New Roman" w:eastAsiaTheme="minorEastAsia" w:hAnsi="Times New Roman" w:cs="Times New Roman"/>
+        </w:rPr>
+        <w:t xml:space="preserve">sing a fixed effects structure </w:t>
+      </w:r>
+      <w:r>
+        <w:rPr>
+          <w:rFonts w:ascii="Times New Roman" w:eastAsiaTheme="minorEastAsia" w:hAnsi="Times New Roman" w:cs="Times New Roman"/>
+        </w:rPr>
+        <w:t xml:space="preserve">Donaldson </w:t>
+      </w:r>
+      <w:r>
+        <w:rPr>
+          <w:rFonts w:ascii="Times New Roman" w:eastAsiaTheme="minorEastAsia" w:hAnsi="Times New Roman" w:cs="Times New Roman"/>
+        </w:rPr>
+        <w:t>absorb</w:t>
+      </w:r>
+      <w:r>
+        <w:rPr>
+          <w:rFonts w:ascii="Times New Roman" w:eastAsiaTheme="minorEastAsia" w:hAnsi="Times New Roman" w:cs="Times New Roman"/>
+        </w:rPr>
+        <w:t>s</w:t>
+      </w:r>
+      <w:r>
+        <w:rPr>
+          <w:rFonts w:ascii="Times New Roman" w:eastAsiaTheme="minorEastAsia" w:hAnsi="Times New Roman" w:cs="Times New Roman"/>
+        </w:rPr>
+        <w:t xml:space="preserve"> </w:t>
+      </w:r>
+      <w:r>
+        <w:rPr>
+          <w:rFonts w:ascii="Times New Roman" w:eastAsiaTheme="minorEastAsia" w:hAnsi="Times New Roman" w:cs="Times New Roman"/>
+        </w:rPr>
+        <w:t xml:space="preserve">the </w:t>
+      </w:r>
+      <w:r>
+        <w:rPr>
+          <w:rFonts w:ascii="Times New Roman" w:eastAsiaTheme="minorEastAsia" w:hAnsi="Times New Roman" w:cs="Times New Roman"/>
+        </w:rPr>
+        <w:t>endogenous variables</w:t>
+      </w:r>
+      <w:r>
+        <w:rPr>
+          <w:rFonts w:ascii="Times New Roman" w:eastAsiaTheme="minorEastAsia" w:hAnsi="Times New Roman" w:cs="Times New Roman"/>
+        </w:rPr>
+        <w:t xml:space="preserve"> in this model</w:t>
+      </w:r>
+      <w:r>
+        <w:rPr>
+          <w:rFonts w:ascii="Times New Roman" w:eastAsiaTheme="minorEastAsia" w:hAnsi="Times New Roman" w:cs="Times New Roman"/>
+        </w:rPr>
+        <w:t>:</w:t>
+      </w:r>
+      <w:r>
+        <w:rPr>
+          <w:rFonts w:ascii="Times New Roman" w:eastAsiaTheme="minorEastAsia" w:hAnsi="Times New Roman" w:cs="Times New Roman"/>
+        </w:rPr>
+        <w:t xml:space="preserve"> rents, prices, and outputs</w:t>
+      </w:r>
+      <w:r>
+        <w:rPr>
+          <w:rFonts w:ascii="Times New Roman" w:eastAsiaTheme="minorEastAsia" w:hAnsi="Times New Roman" w:cs="Times New Roman"/>
+        </w:rPr>
+        <w:t>.</w:t>
+      </w:r>
+      <w:r>
+        <w:rPr>
+          <w:rFonts w:ascii="Times New Roman" w:eastAsiaTheme="minorEastAsia" w:hAnsi="Times New Roman" w:cs="Times New Roman"/>
+        </w:rPr>
+        <w:t xml:space="preserve"> </w:t>
+      </w:r>
+      <w:r>
+        <w:rPr>
+          <w:rFonts w:ascii="Times New Roman" w:eastAsiaTheme="minorEastAsia" w:hAnsi="Times New Roman" w:cs="Times New Roman"/>
+        </w:rPr>
+        <w:t xml:space="preserve">As a result, </w:t>
+      </w:r>
+      <m:oMath>
+        <m:sSub>
+          <m:sSubPr>
+            <m:ctrlPr>
+              <w:rPr>
+                <w:rFonts w:ascii="Cambria Math" w:eastAsiaTheme="minorEastAsia" w:hAnsi="Cambria Math" w:cs="Times New Roman"/>
+                <w:i/>
+              </w:rPr>
+            </m:ctrlPr>
+          </m:sSubPr>
+          <m:e>
+            <m:r>
+              <w:rPr>
+                <w:rFonts w:ascii="Cambria Math" w:eastAsiaTheme="minorEastAsia" w:hAnsi="Cambria Math" w:cs="Times New Roman"/>
+              </w:rPr>
+              <m:t>θ</m:t>
+            </m:r>
+          </m:e>
+          <m:sub>
+            <m:r>
+              <w:rPr>
+                <w:rFonts w:ascii="Cambria Math" w:eastAsiaTheme="minorEastAsia" w:hAnsi="Cambria Math" w:cs="Times New Roman"/>
+              </w:rPr>
+              <m:t>k</m:t>
+            </m:r>
+          </m:sub>
+        </m:sSub>
+      </m:oMath>
+      <w:r>
+        <w:rPr>
+          <w:rFonts w:ascii="Times New Roman" w:eastAsiaTheme="minorEastAsia" w:hAnsi="Times New Roman" w:cs="Times New Roman"/>
+        </w:rPr>
+        <w:t xml:space="preserve"> </w:t>
+      </w:r>
+      <w:r>
+        <w:rPr>
+          <w:rFonts w:ascii="Times New Roman" w:eastAsiaTheme="minorEastAsia" w:hAnsi="Times New Roman" w:cs="Times New Roman"/>
+        </w:rPr>
+        <w:t xml:space="preserve">can be </w:t>
+      </w:r>
+      <w:r>
+        <w:rPr>
+          <w:rFonts w:ascii="Times New Roman" w:eastAsiaTheme="minorEastAsia" w:hAnsi="Times New Roman" w:cs="Times New Roman"/>
+        </w:rPr>
+        <w:t xml:space="preserve">identified purely from how trade flow variations respond to </w:t>
+      </w:r>
+      <w:r>
+        <w:rPr>
+          <w:rFonts w:ascii="Times New Roman" w:eastAsiaTheme="minorEastAsia" w:hAnsi="Times New Roman" w:cs="Times New Roman"/>
+        </w:rPr>
+        <w:t>changes</w:t>
+      </w:r>
+      <w:r>
+        <w:rPr>
+          <w:rFonts w:ascii="Times New Roman" w:eastAsiaTheme="minorEastAsia" w:hAnsi="Times New Roman" w:cs="Times New Roman"/>
+        </w:rPr>
+        <w:t xml:space="preserve"> in effective trading distance.</w:t>
+      </w:r>
+      <w:r>
+        <w:rPr>
+          <w:rFonts w:ascii="Times New Roman" w:eastAsiaTheme="minorEastAsia" w:hAnsi="Times New Roman" w:cs="Times New Roman"/>
+        </w:rPr>
+        <w:t xml:space="preserve"> Finally, Donaldson estimates </w:t>
       </w:r>
       <m:oMath>
         <m:sSub>
@@ -1177,7 +1573,55 @@
         <w:rPr>
           <w:rFonts w:ascii="Times New Roman" w:eastAsiaTheme="minorEastAsia" w:hAnsi="Times New Roman" w:cs="Times New Roman"/>
         </w:rPr>
-        <w:t xml:space="preserve">. He then estimates </w:t>
+        <w:t xml:space="preserve">. </w:t>
+      </w:r>
+      <w:r>
+        <w:rPr>
+          <w:rFonts w:ascii="Times New Roman" w:eastAsiaTheme="minorEastAsia" w:hAnsi="Times New Roman" w:cs="Times New Roman"/>
+        </w:rPr>
+        <w:t>Before modern irrigation, agricultural production and the economy of colonial India</w:t>
+      </w:r>
+      <w:r>
+        <w:rPr>
+          <w:rFonts w:ascii="Times New Roman" w:eastAsiaTheme="minorEastAsia" w:hAnsi="Times New Roman" w:cs="Times New Roman"/>
+        </w:rPr>
+        <w:t>,</w:t>
+      </w:r>
+      <w:r>
+        <w:rPr>
+          <w:rFonts w:ascii="Times New Roman" w:eastAsiaTheme="minorEastAsia" w:hAnsi="Times New Roman" w:cs="Times New Roman"/>
+        </w:rPr>
+        <w:t xml:space="preserve"> </w:t>
+      </w:r>
+      <w:r>
+        <w:rPr>
+          <w:rFonts w:ascii="Times New Roman" w:eastAsiaTheme="minorEastAsia" w:hAnsi="Times New Roman" w:cs="Times New Roman"/>
+        </w:rPr>
+        <w:t>were</w:t>
+      </w:r>
+      <w:r>
+        <w:rPr>
+          <w:rFonts w:ascii="Times New Roman" w:eastAsiaTheme="minorEastAsia" w:hAnsi="Times New Roman" w:cs="Times New Roman"/>
+        </w:rPr>
+        <w:t xml:space="preserve"> heavily tied to rainfall. </w:t>
+      </w:r>
+      <w:r>
+        <w:rPr>
+          <w:rFonts w:ascii="Times New Roman" w:eastAsiaTheme="minorEastAsia" w:hAnsi="Times New Roman" w:cs="Times New Roman"/>
+        </w:rPr>
+        <w:t>Productivity is endogenous, so it must be recovered using an instrument. Rainfall is a credible instrument here because it satisfies both conditions: it is correlated with agricultural productivity (relevance) and weather patterns are independent of trade costs and railroad placement (exclusion).</w:t>
+      </w:r>
+      <w:r>
+        <w:rPr>
+          <w:rFonts w:ascii="Times New Roman" w:eastAsiaTheme="minorEastAsia" w:hAnsi="Times New Roman" w:cs="Times New Roman"/>
+        </w:rPr>
+        <w:t xml:space="preserve"> In the second stage, </w:t>
+      </w:r>
+      <w:r>
+        <w:rPr>
+          <w:rFonts w:ascii="Times New Roman" w:eastAsiaTheme="minorEastAsia" w:hAnsi="Times New Roman" w:cs="Times New Roman"/>
+        </w:rPr>
+        <w:t xml:space="preserve">Donaldson recovers </w:t>
       </w:r>
       <m:oMath>
         <m:sSub>
@@ -1194,7 +1638,7 @@
               <w:rPr>
                 <w:rFonts w:ascii="Cambria Math" w:eastAsiaTheme="minorEastAsia" w:hAnsi="Cambria Math" w:cs="Times New Roman"/>
               </w:rPr>
-              <m:t>θ</m:t>
+              <m:t>A</m:t>
             </m:r>
           </m:e>
           <m:sub>
@@ -1211,67 +1655,368 @@
         <w:rPr>
           <w:rFonts w:ascii="Times New Roman" w:eastAsiaTheme="minorEastAsia" w:hAnsi="Times New Roman" w:cs="Times New Roman"/>
         </w:rPr>
-        <w:t>, th</w:t>
-      </w:r>
-      <w:r>
-        <w:rPr>
-          <w:rFonts w:ascii="Times New Roman" w:eastAsiaTheme="minorEastAsia" w:hAnsi="Times New Roman" w:cs="Times New Roman"/>
-        </w:rPr>
-        <w:t xml:space="preserve">rough </w:t>
-      </w:r>
-      <w:r>
-        <w:rPr>
-          <w:rFonts w:ascii="Times New Roman" w:eastAsiaTheme="minorEastAsia" w:hAnsi="Times New Roman" w:cs="Times New Roman"/>
-        </w:rPr>
-        <w:t xml:space="preserve">the </w:t>
-      </w:r>
-      <w:r>
-        <w:rPr>
-          <w:rFonts w:ascii="Times New Roman" w:eastAsiaTheme="minorEastAsia" w:hAnsi="Times New Roman" w:cs="Times New Roman"/>
-        </w:rPr>
-        <w:t>gravity equation</w:t>
-      </w:r>
-      <w:r>
-        <w:rPr>
-          <w:rFonts w:ascii="Times New Roman" w:eastAsiaTheme="minorEastAsia" w:hAnsi="Times New Roman" w:cs="Times New Roman"/>
-        </w:rPr>
-        <w:t xml:space="preserve">, </w:t>
-      </w:r>
-      <w:r>
-        <w:rPr>
-          <w:rFonts w:ascii="Times New Roman" w:eastAsiaTheme="minorEastAsia" w:hAnsi="Times New Roman" w:cs="Times New Roman"/>
-        </w:rPr>
-        <w:t>a standard model in trade economics that relates bilateral trade flows to the size of trading partners and the distance between them</w:t>
-      </w:r>
-      <w:r>
-        <w:rPr>
-          <w:rFonts w:ascii="Times New Roman" w:eastAsiaTheme="minorEastAsia" w:hAnsi="Times New Roman" w:cs="Times New Roman"/>
-        </w:rPr>
-        <w:t>.</w:t>
-      </w:r>
-      <w:r>
-        <w:rPr>
-          <w:rFonts w:ascii="Times New Roman" w:eastAsiaTheme="minorEastAsia" w:hAnsi="Times New Roman" w:cs="Times New Roman"/>
-        </w:rPr>
-        <w:t xml:space="preserve"> U</w:t>
-      </w:r>
-      <w:r>
-        <w:rPr>
-          <w:rFonts w:ascii="Times New Roman" w:eastAsiaTheme="minorEastAsia" w:hAnsi="Times New Roman" w:cs="Times New Roman"/>
-        </w:rPr>
-        <w:t xml:space="preserve">sing a fixed effects structure </w:t>
-      </w:r>
-      <w:r>
-        <w:rPr>
-          <w:rFonts w:ascii="Times New Roman" w:eastAsiaTheme="minorEastAsia" w:hAnsi="Times New Roman" w:cs="Times New Roman"/>
-        </w:rPr>
-        <w:t xml:space="preserve">Donaldson </w:t>
-      </w:r>
-      <w:r>
-        <w:rPr>
-          <w:rFonts w:ascii="Times New Roman" w:eastAsiaTheme="minorEastAsia" w:hAnsi="Times New Roman" w:cs="Times New Roman"/>
-        </w:rPr>
-        <w:t>absorb</w:t>
+        <w:t xml:space="preserve"> </w:t>
+      </w:r>
+      <w:r>
+        <w:rPr>
+          <w:rFonts w:ascii="Times New Roman" w:eastAsiaTheme="minorEastAsia" w:hAnsi="Times New Roman" w:cs="Times New Roman"/>
+        </w:rPr>
+        <w:t xml:space="preserve">using exporter-commodity, commodity-year, and exporter-year fixed effects to </w:t>
+      </w:r>
+      <w:r>
+        <w:rPr>
+          <w:rFonts w:ascii="Times New Roman" w:eastAsiaTheme="minorEastAsia" w:hAnsi="Times New Roman" w:cs="Times New Roman"/>
+        </w:rPr>
+        <w:lastRenderedPageBreak/>
+        <w:t xml:space="preserve">isolate </w:t>
+      </w:r>
+      <m:oMath>
+        <m:r>
+          <w:rPr>
+            <w:rFonts w:ascii="Cambria Math" w:eastAsiaTheme="minorEastAsia" w:hAnsi="Cambria Math" w:cs="Times New Roman"/>
+          </w:rPr>
+          <m:t>κ</m:t>
+        </m:r>
+      </m:oMath>
+      <w:r>
+        <w:rPr>
+          <w:rFonts w:ascii="Times New Roman" w:eastAsiaTheme="minorEastAsia" w:hAnsi="Times New Roman" w:cs="Times New Roman"/>
+        </w:rPr>
+        <w:t>, the rainfall-productivity elasticity, purely from variation in rainfall across districts, commodities, and time.</w:t>
+      </w:r>
+      <w:r>
+        <w:rPr>
+          <w:rFonts w:ascii="Times New Roman" w:eastAsiaTheme="minorEastAsia" w:hAnsi="Times New Roman" w:cs="Times New Roman"/>
+        </w:rPr>
+        <w:t xml:space="preserve"> </w:t>
+      </w:r>
+    </w:p>
+    <w:p>
+      <w:pPr>
+        <w:ind w:firstLine="720"/>
+        <w:rPr>
+          <w:rFonts w:ascii="Times New Roman" w:eastAsiaTheme="minorEastAsia" w:hAnsi="Times New Roman" w:cs="Times New Roman"/>
+        </w:rPr>
+      </w:pPr>
+      <w:r>
+        <w:rPr>
+          <w:rFonts w:ascii="Times New Roman" w:eastAsiaTheme="minorEastAsia" w:hAnsi="Times New Roman" w:cs="Times New Roman"/>
+        </w:rPr>
+        <w:t>Steps 1 and 2</w:t>
+      </w:r>
+      <w:r>
+        <w:rPr>
+          <w:rFonts w:ascii="Times New Roman" w:eastAsiaTheme="minorEastAsia" w:hAnsi="Times New Roman" w:cs="Times New Roman"/>
+        </w:rPr>
+        <w:t xml:space="preserve"> don’t just provide estimates for these parameters, they also</w:t>
+      </w:r>
+      <w:r>
+        <w:rPr>
+          <w:rFonts w:ascii="Times New Roman" w:eastAsiaTheme="minorEastAsia" w:hAnsi="Times New Roman" w:cs="Times New Roman"/>
+        </w:rPr>
+        <w:t xml:space="preserve"> yield meaningful findings in their own right. Donaldson finds that railroad access significantly reduced trade costs, with road, river, and coastal transport estimated at roughly 2.4, 2.25, and 6.2 times the cost of rail per unit distance respectively. Step 2 finds a statistically significant elasticity of bilateral trade flows with respect to effective distance of -1.603, consistent with the broader gravity equation literature.</w:t>
+      </w:r>
+      <w:r>
+        <w:rPr>
+          <w:rFonts w:ascii="Times New Roman" w:eastAsiaTheme="minorEastAsia" w:hAnsi="Times New Roman" w:cs="Times New Roman"/>
+        </w:rPr>
+        <w:t xml:space="preserve"> </w:t>
+      </w:r>
+      <w:r>
+        <w:rPr>
+          <w:rFonts w:ascii="Times New Roman" w:eastAsiaTheme="minorEastAsia" w:hAnsi="Times New Roman" w:cs="Times New Roman"/>
+        </w:rPr>
+        <w:t>Having already shown that railroad access significantly reduced trade costs and expanded bilateral trade flows, Donaldson turns to two further questions: (1) whether railroad access translated into real income gains, and (2) how much of that real income gain can be attributed to gains from trade, tested through a sufficient statistic derived from each district's own-expenditure share.</w:t>
+      </w:r>
+    </w:p>
+    <w:p>
+      <w:pPr>
+        <w:ind w:firstLine="720"/>
+        <w:rPr>
+          <w:rFonts w:ascii="Times New Roman" w:eastAsiaTheme="minorEastAsia" w:hAnsi="Times New Roman" w:cs="Times New Roman"/>
+        </w:rPr>
+      </w:pPr>
+      <w:r>
+        <w:rPr>
+          <w:rFonts w:ascii="Times New Roman" w:eastAsiaTheme="minorEastAsia" w:hAnsi="Times New Roman" w:cs="Times New Roman"/>
+        </w:rPr>
+        <w:t xml:space="preserve">Donaldson shows that railroad access translates into real income gains. He does so by regressing the natural log of real agricultural income per acre on a railroad access dummy, equal to 1 if any part of the district is connected to the railroad network in time </w:t>
+      </w:r>
+      <m:oMath>
+        <m:r>
+          <w:rPr>
+            <w:rFonts w:ascii="Cambria Math" w:eastAsiaTheme="minorEastAsia" w:hAnsi="Cambria Math" w:cs="Times New Roman"/>
+          </w:rPr>
+          <m:t>t</m:t>
+        </m:r>
+      </m:oMath>
+      <w:r>
+        <w:rPr>
+          <w:rFonts w:ascii="Times New Roman" w:eastAsiaTheme="minorEastAsia" w:hAnsi="Times New Roman" w:cs="Times New Roman"/>
+        </w:rPr>
+        <w:t xml:space="preserve"> and </w:t>
+      </w:r>
+      <m:oMath>
+        <m:r>
+          <w:rPr>
+            <w:rFonts w:ascii="Cambria Math" w:eastAsiaTheme="minorEastAsia" w:hAnsi="Cambria Math" w:cs="Times New Roman"/>
+          </w:rPr>
+          <m:t>0</m:t>
+        </m:r>
+      </m:oMath>
+      <w:r>
+        <w:rPr>
+          <w:rFonts w:ascii="Times New Roman" w:eastAsiaTheme="minorEastAsia" w:hAnsi="Times New Roman" w:cs="Times New Roman"/>
+        </w:rPr>
+        <w:t xml:space="preserve"> otherwise, alongside district and year fixed effects. The dependent variable is real agricultural income per acre, constructed as the log of nominal rents deflated by a district-level price index, </w:t>
+      </w:r>
+      <m:oMath>
+        <m:r>
+          <w:rPr>
+            <w:rFonts w:ascii="Cambria Math" w:eastAsiaTheme="minorEastAsia" w:hAnsi="Cambria Math" w:cs="Times New Roman"/>
+          </w:rPr>
+          <m:t>ln(</m:t>
+        </m:r>
+        <m:sSub>
+          <m:sSubPr>
+            <m:ctrlPr>
+              <w:rPr>
+                <w:rFonts w:ascii="Cambria Math" w:eastAsiaTheme="minorEastAsia" w:hAnsi="Cambria Math" w:cs="Times New Roman"/>
+                <w:i/>
+              </w:rPr>
+            </m:ctrlPr>
+          </m:sSubPr>
+          <m:e>
+            <m:r>
+              <w:rPr>
+                <w:rFonts w:ascii="Cambria Math" w:eastAsiaTheme="minorEastAsia" w:hAnsi="Cambria Math" w:cs="Times New Roman"/>
+              </w:rPr>
+              <m:t>r</m:t>
+            </m:r>
+          </m:e>
+          <m:sub>
+            <m:r>
+              <w:rPr>
+                <w:rFonts w:ascii="Cambria Math" w:eastAsiaTheme="minorEastAsia" w:hAnsi="Cambria Math" w:cs="Times New Roman"/>
+              </w:rPr>
+              <m:t>ot</m:t>
+            </m:r>
+          </m:sub>
+        </m:sSub>
+        <m:r>
+          <w:rPr>
+            <w:rFonts w:ascii="Cambria Math" w:eastAsiaTheme="minorEastAsia" w:hAnsi="Cambria Math" w:cs="Times New Roman"/>
+          </w:rPr>
+          <m:t>/</m:t>
+        </m:r>
+        <m:sSub>
+          <m:sSubPr>
+            <m:ctrlPr>
+              <w:rPr>
+                <w:rFonts w:ascii="Cambria Math" w:eastAsiaTheme="minorEastAsia" w:hAnsi="Cambria Math" w:cs="Times New Roman"/>
+                <w:i/>
+              </w:rPr>
+            </m:ctrlPr>
+          </m:sSubPr>
+          <m:e>
+            <m:r>
+              <w:rPr>
+                <w:rFonts w:ascii="Cambria Math" w:eastAsiaTheme="minorEastAsia" w:hAnsi="Cambria Math" w:cs="Times New Roman"/>
+              </w:rPr>
+              <m:t>P</m:t>
+            </m:r>
+          </m:e>
+          <m:sub>
+            <m:r>
+              <w:rPr>
+                <w:rFonts w:ascii="Cambria Math" w:eastAsiaTheme="minorEastAsia" w:hAnsi="Cambria Math" w:cs="Times New Roman"/>
+              </w:rPr>
+              <m:t>ot</m:t>
+            </m:r>
+          </m:sub>
+        </m:sSub>
+        <m:r>
+          <w:rPr>
+            <w:rFonts w:ascii="Cambria Math" w:eastAsiaTheme="minorEastAsia" w:hAnsi="Cambria Math" w:cs="Times New Roman"/>
+          </w:rPr>
+          <m:t>)</m:t>
+        </m:r>
+      </m:oMath>
+      <w:r>
+        <w:rPr>
+          <w:rFonts w:ascii="Times New Roman" w:eastAsiaTheme="minorEastAsia" w:hAnsi="Times New Roman" w:cs="Times New Roman"/>
+        </w:rPr>
+        <w:t>, ensuring that the estimated income gains reflect real purchasing power rather than nominal price changes.</w:t>
+      </w:r>
+      <w:r>
+        <w:rPr>
+          <w:rFonts w:ascii="Times New Roman" w:eastAsiaTheme="minorEastAsia" w:hAnsi="Times New Roman" w:cs="Times New Roman"/>
+        </w:rPr>
+        <w:t xml:space="preserve"> </w:t>
+      </w:r>
+      <w:r>
+        <w:rPr>
+          <w:rFonts w:ascii="Times New Roman" w:eastAsiaTheme="minorEastAsia" w:hAnsi="Times New Roman" w:cs="Times New Roman"/>
+        </w:rPr>
+        <w:t>After controlling for these, any remaining variation in real income is identified entirely from within-district changes in railroad access over time, giving this a difference-in-differences flavor. This estimates</w:t>
+      </w:r>
+      <w:r>
+        <w:rPr>
+          <w:rFonts w:ascii="Times New Roman" w:eastAsiaTheme="minorEastAsia" w:hAnsi="Times New Roman" w:cs="Times New Roman"/>
+        </w:rPr>
+        <w:t xml:space="preserve"> </w:t>
+      </w:r>
+      <m:oMath>
+        <m:r>
+          <w:rPr>
+            <w:rFonts w:ascii="Cambria Math" w:eastAsiaTheme="minorEastAsia" w:hAnsi="Cambria Math" w:cs="Times New Roman"/>
+          </w:rPr>
+          <m:t>γ</m:t>
+        </m:r>
+      </m:oMath>
+      <w:r>
+        <w:rPr>
+          <w:rFonts w:ascii="Times New Roman" w:eastAsiaTheme="minorEastAsia" w:hAnsi="Times New Roman" w:cs="Times New Roman"/>
+        </w:rPr>
+        <w:t>,</w:t>
+      </w:r>
+      <w:r>
+        <w:rPr>
+          <w:rFonts w:ascii="Times New Roman" w:eastAsiaTheme="minorEastAsia" w:hAnsi="Times New Roman" w:cs="Times New Roman"/>
+        </w:rPr>
+        <w:t xml:space="preserve"> the Average Treatment Effect, ATE, of railroad access on real income across all districts in the sample.</w:t>
+      </w:r>
+      <w:r>
+        <w:rPr>
+          <w:rFonts w:ascii="Times New Roman" w:eastAsiaTheme="minorEastAsia" w:hAnsi="Times New Roman" w:cs="Times New Roman"/>
+        </w:rPr>
+        <w:t xml:space="preserve"> </w:t>
+      </w:r>
+      <w:r>
+        <w:rPr>
+          <w:rFonts w:ascii="Times New Roman" w:eastAsiaTheme="minorEastAsia" w:hAnsi="Times New Roman" w:cs="Times New Roman"/>
+        </w:rPr>
+        <w:t>Donaldson finds that railroad access increases real incomes by approximately 16%, a finding made credible by the difference-in-differences structure that absorbs time-invariant district characteristics and common time trends.</w:t>
+      </w:r>
+      <w:r>
+        <w:rPr>
+          <w:rFonts w:ascii="Times New Roman" w:eastAsiaTheme="minorEastAsia" w:hAnsi="Times New Roman" w:cs="Times New Roman"/>
+        </w:rPr>
+        <w:t xml:space="preserve"> </w:t>
+      </w:r>
+    </w:p>
+    <w:p>
+      <w:pPr>
+        <w:ind w:firstLine="720"/>
+        <w:rPr>
+          <w:rFonts w:ascii="Times New Roman" w:eastAsiaTheme="minorEastAsia" w:hAnsi="Times New Roman" w:cs="Times New Roman"/>
+        </w:rPr>
+      </w:pPr>
+      <w:r>
+        <w:rPr>
+          <w:rFonts w:ascii="Times New Roman" w:eastAsiaTheme="minorEastAsia" w:hAnsi="Times New Roman" w:cs="Times New Roman"/>
+        </w:rPr>
+        <w:t xml:space="preserve">The </w:t>
+      </w:r>
+      <w:r>
+        <w:rPr>
+          <w:rFonts w:ascii="Times New Roman" w:eastAsiaTheme="minorEastAsia" w:hAnsi="Times New Roman" w:cs="Times New Roman"/>
+        </w:rPr>
+        <w:t xml:space="preserve">concern </w:t>
+      </w:r>
+      <w:r>
+        <w:rPr>
+          <w:rFonts w:ascii="Times New Roman" w:eastAsiaTheme="minorEastAsia" w:hAnsi="Times New Roman" w:cs="Times New Roman"/>
+        </w:rPr>
+        <w:t xml:space="preserve">with accepting this finding at face value is the endogeneity. </w:t>
+      </w:r>
+      <w:r>
+        <w:rPr>
+          <w:rFonts w:ascii="Times New Roman" w:eastAsiaTheme="minorEastAsia" w:hAnsi="Times New Roman" w:cs="Times New Roman"/>
+        </w:rPr>
+        <w:t>As with many large infrastructure projects</w:t>
+      </w:r>
+      <w:r>
+        <w:rPr>
+          <w:rFonts w:ascii="Times New Roman" w:eastAsiaTheme="minorEastAsia" w:hAnsi="Times New Roman" w:cs="Times New Roman"/>
+        </w:rPr>
+        <w:t xml:space="preserve">, the placement of the </w:t>
+      </w:r>
+      <w:r>
+        <w:rPr>
+          <w:rFonts w:ascii="Times New Roman" w:eastAsiaTheme="minorEastAsia" w:hAnsi="Times New Roman" w:cs="Times New Roman"/>
+        </w:rPr>
+        <w:t>railroads may have been built in districts already poised for economic growth</w:t>
+      </w:r>
+      <w:r>
+        <w:rPr>
+          <w:rFonts w:ascii="Times New Roman" w:eastAsiaTheme="minorEastAsia" w:hAnsi="Times New Roman" w:cs="Times New Roman"/>
+        </w:rPr>
+        <w:t xml:space="preserve"> or for other unknown factors. Donaldson addresses this robustly by running three placebo tests using </w:t>
+      </w:r>
+      <w:r>
+        <w:rPr>
+          <w:rFonts w:ascii="Times New Roman" w:eastAsiaTheme="minorEastAsia" w:hAnsi="Times New Roman" w:cs="Times New Roman"/>
+        </w:rPr>
+        <w:t xml:space="preserve">planned but never-built railroad lines. If the 16% income effect were spurious, these unbuilt lines should show similar effects. However, Donaldson finds no significant effect for unbuilt lines suggesting that </w:t>
+      </w:r>
+      <w:r>
+        <w:rPr>
+          <w:rFonts w:ascii="Times New Roman" w:eastAsiaTheme="minorEastAsia" w:hAnsi="Times New Roman" w:cs="Times New Roman"/>
+        </w:rPr>
+        <w:t xml:space="preserve">Donaldson's causal interpretation of </w:t>
+      </w:r>
+      <m:oMath>
+        <m:r>
+          <w:rPr>
+            <w:rFonts w:ascii="Cambria Math" w:eastAsiaTheme="minorEastAsia" w:hAnsi="Cambria Math" w:cs="Times New Roman"/>
+          </w:rPr>
+          <m:t>γ</m:t>
+        </m:r>
+      </m:oMath>
+      <w:r>
+        <w:rPr>
+          <w:rFonts w:ascii="Times New Roman" w:eastAsiaTheme="minorEastAsia" w:hAnsi="Times New Roman" w:cs="Times New Roman"/>
+        </w:rPr>
+        <w:t xml:space="preserve"> is supported.</w:t>
+      </w:r>
+    </w:p>
+    <w:p>
+      <w:pPr>
+        <w:ind w:firstLine="720"/>
+        <w:rPr>
+          <w:rFonts w:ascii="Times New Roman" w:eastAsiaTheme="minorEastAsia" w:hAnsi="Times New Roman" w:cs="Times New Roman"/>
+        </w:rPr>
+      </w:pPr>
+      <w:r>
+        <w:rPr>
+          <w:rFonts w:ascii="Times New Roman" w:eastAsiaTheme="minorEastAsia" w:hAnsi="Times New Roman" w:cs="Times New Roman"/>
+        </w:rPr>
+        <w:t xml:space="preserve">With quantitative proof that railroad access increased real incomes, </w:t>
+      </w:r>
+      <w:r>
+        <w:rPr>
+          <w:rFonts w:ascii="Times New Roman" w:eastAsiaTheme="minorEastAsia" w:hAnsi="Times New Roman" w:cs="Times New Roman"/>
+        </w:rPr>
+        <w:t>Donaldson turns to decomposing the source of those gains</w:t>
+      </w:r>
+      <w:r>
+        <w:rPr>
+          <w:rFonts w:ascii="Times New Roman" w:eastAsiaTheme="minorEastAsia" w:hAnsi="Times New Roman" w:cs="Times New Roman"/>
+        </w:rPr>
+        <w:t xml:space="preserve">. </w:t>
+      </w:r>
+      <w:r>
+        <w:rPr>
+          <w:rFonts w:ascii="Times New Roman" w:eastAsiaTheme="minorEastAsia" w:hAnsi="Times New Roman" w:cs="Times New Roman"/>
+        </w:rPr>
+        <w:t>He does this through a sufficient statistic, a district's own-expenditure share, which captures how much of a district's expenditure is spent on locally produced goods rather than imported ones, serving as a measure of trade integration.</w:t>
+      </w:r>
+      <w:r>
+        <w:rPr>
+          <w:rFonts w:ascii="Times New Roman" w:eastAsiaTheme="minorEastAsia" w:hAnsi="Times New Roman" w:cs="Times New Roman"/>
+        </w:rPr>
+        <w:t xml:space="preserve"> Donaldson show</w:t>
       </w:r>
       <w:r>
         <w:rPr>
@@ -1283,55 +2028,19 @@
         <w:rPr>
           <w:rFonts w:ascii="Times New Roman" w:eastAsiaTheme="minorEastAsia" w:hAnsi="Times New Roman" w:cs="Times New Roman"/>
         </w:rPr>
-        <w:t xml:space="preserve"> </w:t>
-      </w:r>
-      <w:r>
-        <w:rPr>
-          <w:rFonts w:ascii="Times New Roman" w:eastAsiaTheme="minorEastAsia" w:hAnsi="Times New Roman" w:cs="Times New Roman"/>
-        </w:rPr>
-        <w:t xml:space="preserve">the </w:t>
-      </w:r>
-      <w:r>
-        <w:rPr>
-          <w:rFonts w:ascii="Times New Roman" w:eastAsiaTheme="minorEastAsia" w:hAnsi="Times New Roman" w:cs="Times New Roman"/>
-        </w:rPr>
-        <w:t>endogenous variables</w:t>
-      </w:r>
-      <w:r>
-        <w:rPr>
-          <w:rFonts w:ascii="Times New Roman" w:eastAsiaTheme="minorEastAsia" w:hAnsi="Times New Roman" w:cs="Times New Roman"/>
-        </w:rPr>
-        <w:t xml:space="preserve"> in this model</w:t>
-      </w:r>
-      <w:r>
-        <w:rPr>
-          <w:rFonts w:ascii="Times New Roman" w:eastAsiaTheme="minorEastAsia" w:hAnsi="Times New Roman" w:cs="Times New Roman"/>
-        </w:rPr>
-        <w:t>:</w:t>
-      </w:r>
-      <w:r>
-        <w:rPr>
-          <w:rFonts w:ascii="Times New Roman" w:eastAsiaTheme="minorEastAsia" w:hAnsi="Times New Roman" w:cs="Times New Roman"/>
-        </w:rPr>
-        <w:t xml:space="preserve"> rents, prices, and outputs</w:t>
-      </w:r>
-      <w:r>
-        <w:rPr>
-          <w:rFonts w:ascii="Times New Roman" w:eastAsiaTheme="minorEastAsia" w:hAnsi="Times New Roman" w:cs="Times New Roman"/>
-        </w:rPr>
-        <w:t>.</w:t>
-      </w:r>
-      <w:r>
-        <w:rPr>
-          <w:rFonts w:ascii="Times New Roman" w:eastAsiaTheme="minorEastAsia" w:hAnsi="Times New Roman" w:cs="Times New Roman"/>
-        </w:rPr>
-        <w:t xml:space="preserve"> </w:t>
-      </w:r>
-      <w:r>
-        <w:rPr>
-          <w:rFonts w:ascii="Times New Roman" w:eastAsiaTheme="minorEastAsia" w:hAnsi="Times New Roman" w:cs="Times New Roman"/>
-        </w:rPr>
-        <w:t xml:space="preserve">As a result, </w:t>
+        <w:t xml:space="preserve"> that real agricultural income is a function of only two terms: productivity and the “trade share”</w:t>
+      </w:r>
+      <w:r>
+        <w:rPr>
+          <w:rFonts w:ascii="Times New Roman" w:eastAsiaTheme="minorEastAsia" w:hAnsi="Times New Roman" w:cs="Times New Roman"/>
+        </w:rPr>
+        <w:t xml:space="preserve">. While productivity is exogenous, trade share captures all of the effects that railroads could generate in his model. </w:t>
+      </w:r>
+      <w:r>
+        <w:rPr>
+          <w:rFonts w:ascii="Times New Roman" w:eastAsiaTheme="minorEastAsia" w:hAnsi="Times New Roman" w:cs="Times New Roman"/>
+        </w:rPr>
+        <w:t xml:space="preserve">However, the own-expenditure share, </w:t>
       </w:r>
       <m:oMath>
         <m:sSub>
@@ -1348,7 +2057,7 @@
               <w:rPr>
                 <w:rFonts w:ascii="Cambria Math" w:eastAsiaTheme="minorEastAsia" w:hAnsi="Cambria Math" w:cs="Times New Roman"/>
               </w:rPr>
-              <m:t>θ</m:t>
+              <m:t>π</m:t>
             </m:r>
           </m:e>
           <m:sub>
@@ -1356,7 +2065,7 @@
               <w:rPr>
                 <w:rFonts w:ascii="Cambria Math" w:eastAsiaTheme="minorEastAsia" w:hAnsi="Cambria Math" w:cs="Times New Roman"/>
               </w:rPr>
-              <m:t>k</m:t>
+              <m:t>oot</m:t>
             </m:r>
           </m:sub>
         </m:sSub>
@@ -1365,31 +2074,26 @@
         <w:rPr>
           <w:rFonts w:ascii="Times New Roman" w:eastAsiaTheme="minorEastAsia" w:hAnsi="Times New Roman" w:cs="Times New Roman"/>
         </w:rPr>
+        <w:t xml:space="preserve">, is unobservable in the </w:t>
+      </w:r>
+      <w:r>
+        <w:rPr>
+          <w:rFonts w:ascii="Times New Roman" w:eastAsiaTheme="minorEastAsia" w:hAnsi="Times New Roman" w:cs="Times New Roman"/>
+        </w:rPr>
+        <w:lastRenderedPageBreak/>
+        <w:t>data as intra-district trade was never recorded in colonial India.</w:t>
+      </w:r>
+      <w:r>
+        <w:rPr>
+          <w:rFonts w:ascii="Times New Roman" w:eastAsiaTheme="minorEastAsia" w:hAnsi="Times New Roman" w:cs="Times New Roman"/>
+        </w:rPr>
         <w:t xml:space="preserve"> </w:t>
       </w:r>
       <w:r>
         <w:rPr>
           <w:rFonts w:ascii="Times New Roman" w:eastAsiaTheme="minorEastAsia" w:hAnsi="Times New Roman" w:cs="Times New Roman"/>
         </w:rPr>
-        <w:t xml:space="preserve">can be </w:t>
-      </w:r>
-      <w:r>
-        <w:rPr>
-          <w:rFonts w:ascii="Times New Roman" w:eastAsiaTheme="minorEastAsia" w:hAnsi="Times New Roman" w:cs="Times New Roman"/>
-        </w:rPr>
-        <w:t xml:space="preserve">identified purely from how trade flow variations respond to </w:t>
-      </w:r>
-      <w:r>
-        <w:rPr>
-          <w:rFonts w:ascii="Times New Roman" w:eastAsiaTheme="minorEastAsia" w:hAnsi="Times New Roman" w:cs="Times New Roman"/>
-        </w:rPr>
-        <w:t>changes</w:t>
-      </w:r>
-      <w:r>
-        <w:rPr>
-          <w:rFonts w:ascii="Times New Roman" w:eastAsiaTheme="minorEastAsia" w:hAnsi="Times New Roman" w:cs="Times New Roman"/>
-        </w:rPr>
-        <w:t xml:space="preserve"> in effective trading distance.</w:t>
+        <w:t>To overcome this, Donaldson solves for</w:t>
       </w:r>
       <w:r>
         <w:rPr>
@@ -1397,17 +2101,75 @@
         </w:rPr>
         <w:t xml:space="preserve"> </w:t>
       </w:r>
-      <w:r>
-        <w:rPr>
-          <w:rFonts w:ascii="Times New Roman" w:eastAsiaTheme="minorEastAsia" w:hAnsi="Times New Roman" w:cs="Times New Roman"/>
-        </w:rPr>
-        <w:t>Donaldson strategically measures alternate modes of trade (road, river, coast) in terms of ‘rail distance</w:t>
-      </w:r>
-      <w:r>
-        <w:rPr>
-          <w:rFonts w:ascii="Times New Roman" w:eastAsiaTheme="minorEastAsia" w:hAnsi="Times New Roman" w:cs="Times New Roman"/>
-        </w:rPr>
-        <w:t>’</w:t>
+      <m:oMath>
+        <m:sSub>
+          <m:sSubPr>
+            <m:ctrlPr>
+              <w:rPr>
+                <w:rFonts w:ascii="Cambria Math" w:eastAsiaTheme="minorEastAsia" w:hAnsi="Cambria Math" w:cs="Times New Roman"/>
+                <w:i/>
+              </w:rPr>
+            </m:ctrlPr>
+          </m:sSubPr>
+          <m:e>
+            <m:r>
+              <w:rPr>
+                <w:rFonts w:ascii="Cambria Math" w:eastAsiaTheme="minorEastAsia" w:hAnsi="Cambria Math" w:cs="Times New Roman"/>
+              </w:rPr>
+              <m:t>π</m:t>
+            </m:r>
+          </m:e>
+          <m:sub>
+            <m:r>
+              <w:rPr>
+                <w:rFonts w:ascii="Cambria Math" w:eastAsiaTheme="minorEastAsia" w:hAnsi="Cambria Math" w:cs="Times New Roman"/>
+              </w:rPr>
+              <m:t>oot</m:t>
+            </m:r>
+          </m:sub>
+        </m:sSub>
+      </m:oMath>
+      <w:r>
+        <w:rPr>
+          <w:rFonts w:ascii="Times New Roman" w:eastAsiaTheme="minorEastAsia" w:hAnsi="Times New Roman" w:cs="Times New Roman"/>
+        </w:rPr>
+        <w:t xml:space="preserve"> directly from the model equilibrium using all parameters estimated in Steps 1 and 2 alongside exogenous variables including rainfall, the transportation network, and district land sizes.</w:t>
+      </w:r>
+      <w:r>
+        <w:rPr>
+          <w:rFonts w:ascii="Times New Roman" w:eastAsiaTheme="minorEastAsia" w:hAnsi="Times New Roman" w:cs="Times New Roman"/>
+        </w:rPr>
+        <w:t xml:space="preserve"> </w:t>
+      </w:r>
+      <w:r>
+        <w:rPr>
+          <w:rFonts w:ascii="Times New Roman" w:eastAsiaTheme="minorEastAsia" w:hAnsi="Times New Roman" w:cs="Times New Roman"/>
+        </w:rPr>
+        <w:t xml:space="preserve">Donaldson </w:t>
+      </w:r>
+      <w:r>
+        <w:rPr>
+          <w:rFonts w:ascii="Times New Roman" w:eastAsiaTheme="minorEastAsia" w:hAnsi="Times New Roman" w:cs="Times New Roman"/>
+        </w:rPr>
+        <w:t xml:space="preserve">reruns the regression in </w:t>
+      </w:r>
+      <w:r>
+        <w:rPr>
+          <w:rFonts w:ascii="Times New Roman" w:eastAsiaTheme="minorEastAsia" w:hAnsi="Times New Roman" w:cs="Times New Roman"/>
+        </w:rPr>
+        <w:t>Step 3</w:t>
+      </w:r>
+      <w:r>
+        <w:rPr>
+          <w:rFonts w:ascii="Times New Roman" w:eastAsiaTheme="minorEastAsia" w:hAnsi="Times New Roman" w:cs="Times New Roman"/>
+        </w:rPr>
+        <w:t xml:space="preserve"> but </w:t>
+      </w:r>
+      <w:r>
+        <w:rPr>
+          <w:rFonts w:ascii="Times New Roman" w:eastAsiaTheme="minorEastAsia" w:hAnsi="Times New Roman" w:cs="Times New Roman"/>
+        </w:rPr>
+        <w:t>additionally controls for rainfall and includes the model-predicted trade share</w:t>
       </w:r>
       <w:r>
         <w:rPr>
@@ -1419,31 +2181,69 @@
         <w:rPr>
           <w:rFonts w:ascii="Times New Roman" w:eastAsiaTheme="minorEastAsia" w:hAnsi="Times New Roman" w:cs="Times New Roman"/>
         </w:rPr>
-        <w:t>These distances act as weights in the transportation network, grounded in historical freight rate data</w:t>
-      </w:r>
-      <w:r>
-        <w:rPr>
-          <w:rFonts w:ascii="Times New Roman" w:eastAsiaTheme="minorEastAsia" w:hAnsi="Times New Roman" w:cs="Times New Roman"/>
-        </w:rPr>
-        <w:t xml:space="preserve"> </w:t>
-      </w:r>
-      <w:r>
-        <w:rPr>
-          <w:rFonts w:ascii="Times New Roman" w:eastAsiaTheme="minorEastAsia" w:hAnsi="Times New Roman" w:cs="Times New Roman"/>
-        </w:rPr>
-        <w:t>and estimated through NLS, they establish</w:t>
-      </w:r>
-      <w:r>
-        <w:rPr>
-          <w:rFonts w:ascii="Times New Roman" w:eastAsiaTheme="minorEastAsia" w:hAnsi="Times New Roman" w:cs="Times New Roman"/>
-        </w:rPr>
-        <w:t xml:space="preserve"> a credible counterfactual of what trade costs would have looked like across all modes in the absence of railroad expansion</w:t>
+        <w:t>In this specification the baseline railroad access coefficient is 0.258, slightly larger than the Step 3 estimate due to the rainfall correction</w:t>
       </w:r>
       <w:r>
         <w:rPr>
           <w:rFonts w:ascii="Times New Roman" w:eastAsiaTheme="minorEastAsia" w:hAnsi="Times New Roman" w:cs="Times New Roman"/>
         </w:rPr>
         <w:t xml:space="preserve">. </w:t>
+      </w:r>
+      <w:r>
+        <w:rPr>
+          <w:rFonts w:ascii="Times New Roman" w:eastAsiaTheme="minorEastAsia" w:hAnsi="Times New Roman" w:cs="Times New Roman"/>
+        </w:rPr>
+        <w:t xml:space="preserve">When the trade share is added, </w:t>
+      </w:r>
+      <m:oMath>
+        <m:r>
+          <w:rPr>
+            <w:rFonts w:ascii="Cambria Math" w:eastAsiaTheme="minorEastAsia" w:hAnsi="Cambria Math" w:cs="Times New Roman"/>
+          </w:rPr>
+          <m:t>γ</m:t>
+        </m:r>
+      </m:oMath>
+      <w:r>
+        <w:rPr>
+          <w:rFonts w:ascii="Times New Roman" w:eastAsiaTheme="minorEastAsia" w:hAnsi="Times New Roman" w:cs="Times New Roman"/>
+        </w:rPr>
+        <w:t xml:space="preserve"> falls </w:t>
+      </w:r>
+      <w:r>
+        <w:rPr>
+          <w:rFonts w:ascii="Times New Roman" w:eastAsiaTheme="minorEastAsia" w:hAnsi="Times New Roman" w:cs="Times New Roman"/>
+        </w:rPr>
+        <w:t xml:space="preserve">by roughly half </w:t>
+      </w:r>
+      <w:r>
+        <w:rPr>
+          <w:rFonts w:ascii="Times New Roman" w:eastAsiaTheme="minorEastAsia" w:hAnsi="Times New Roman" w:cs="Times New Roman"/>
+        </w:rPr>
+        <w:t>to 0.124</w:t>
+      </w:r>
+      <w:r>
+        <w:rPr>
+          <w:rFonts w:ascii="Times New Roman" w:eastAsiaTheme="minorEastAsia" w:hAnsi="Times New Roman" w:cs="Times New Roman"/>
+        </w:rPr>
+        <w:t>. This implies that approximately 52% of the real income gain from railroad access is attributable to gains from trade through comparative advantage, with the remainder left unexplained by the trade mechanism alone</w:t>
+      </w:r>
+      <w:r>
+        <w:rPr>
+          <w:rFonts w:ascii="Times New Roman" w:eastAsiaTheme="minorEastAsia" w:hAnsi="Times New Roman" w:cs="Times New Roman"/>
+        </w:rPr>
+        <w:t xml:space="preserve">. </w:t>
+      </w:r>
+      <w:r>
+        <w:rPr>
+          <w:rFonts w:ascii="Times New Roman" w:eastAsiaTheme="minorEastAsia" w:hAnsi="Times New Roman" w:cs="Times New Roman"/>
+        </w:rPr>
+        <w:t>Because the sufficient statistic is derived from the structural model rather than the specific historical context, these findings have broad policy implications for any infrastructure investment that reduces trade costs</w:t>
+      </w:r>
+      <w:r>
+        <w:rPr>
+          <w:rFonts w:ascii="Times New Roman" w:eastAsiaTheme="minorEastAsia" w:hAnsi="Times New Roman" w:cs="Times New Roman"/>
+        </w:rPr>
+        <w:t>, such as interstate highway planning.</w:t>
       </w:r>
     </w:p>
     <w:p>
@@ -1457,13 +2257,160 @@
         <w:rPr>
           <w:rFonts w:ascii="Times New Roman" w:eastAsiaTheme="minorEastAsia" w:hAnsi="Times New Roman" w:cs="Times New Roman"/>
         </w:rPr>
-        <w:t>Using this network of transportation methods and effective distances, the output is the Least Cost Route Effective Distance, LCRED, which expresses the cheapest route between any two districts in rail-equivalent kilometers. It is from variation in LCRED, driven by the opening of new railroad segments over time, that Donaldson estimates δ, the elasticity of trade costs with respect to effective distance. Donaldson exploits price differentials of salt, a homogenous good, whose uniform quality across districts ensures that observed price gaps reflect trade costs alone rather than quality differences or product differentiation.</w:t>
-      </w:r>
-      <w:r>
-        <w:rPr>
-          <w:rFonts w:ascii="Times New Roman" w:eastAsiaTheme="minorEastAsia" w:hAnsi="Times New Roman" w:cs="Times New Roman"/>
-        </w:rPr>
-        <w:t xml:space="preserve"> &lt;DISCUSS THE REGRESSION&gt;</w:t>
+        <w:t>Across all four empirical steps, Donaldson's identification strategy relies on a combination of fixed effects, instrumental variables, and structural modeling. The Step 3 regression estimates the Average Treatment Effect, ATE, of railroad access on real income across all districts in the sample</w:t>
+      </w:r>
+      <w:r>
+        <w:rPr>
+          <w:rFonts w:ascii="Times New Roman" w:eastAsiaTheme="minorEastAsia" w:hAnsi="Times New Roman" w:cs="Times New Roman"/>
+        </w:rPr>
+        <w:t>. Donaldson</w:t>
+      </w:r>
+      <w:r>
+        <w:rPr>
+          <w:rFonts w:ascii="Times New Roman" w:eastAsiaTheme="minorEastAsia" w:hAnsi="Times New Roman" w:cs="Times New Roman"/>
+        </w:rPr>
+        <w:t xml:space="preserve"> </w:t>
+      </w:r>
+      <w:r>
+        <w:rPr>
+          <w:rFonts w:ascii="Times New Roman" w:eastAsiaTheme="minorEastAsia" w:hAnsi="Times New Roman" w:cs="Times New Roman"/>
+        </w:rPr>
+        <w:t xml:space="preserve">finds </w:t>
+      </w:r>
+      <w:r>
+        <w:rPr>
+          <w:rFonts w:ascii="Times New Roman" w:eastAsiaTheme="minorEastAsia" w:hAnsi="Times New Roman" w:cs="Times New Roman"/>
+        </w:rPr>
+        <w:t xml:space="preserve">that railroad access increases real incomes by approximately 16%. However, given that </w:t>
+      </w:r>
+      <w:r>
+        <w:rPr>
+          <w:rFonts w:ascii="Times New Roman" w:eastAsiaTheme="minorEastAsia" w:hAnsi="Times New Roman" w:cs="Times New Roman"/>
+        </w:rPr>
+        <w:t xml:space="preserve">the true </w:t>
+      </w:r>
+      <w:r>
+        <w:rPr>
+          <w:rFonts w:ascii="Times New Roman" w:eastAsiaTheme="minorEastAsia" w:hAnsi="Times New Roman" w:cs="Times New Roman"/>
+        </w:rPr>
+        <w:t xml:space="preserve">railroad placement was driven primarily by military considerations </w:t>
+      </w:r>
+      <w:r>
+        <w:rPr>
+          <w:rFonts w:ascii="Times New Roman" w:eastAsiaTheme="minorEastAsia" w:hAnsi="Times New Roman" w:cs="Times New Roman"/>
+        </w:rPr>
+        <w:t xml:space="preserve">of the British Empire </w:t>
+      </w:r>
+      <w:r>
+        <w:rPr>
+          <w:rFonts w:ascii="Times New Roman" w:eastAsiaTheme="minorEastAsia" w:hAnsi="Times New Roman" w:cs="Times New Roman"/>
+        </w:rPr>
+        <w:t>rather than economic potential, what is truly identified is closer to a Local Average Treatment Effect, LATE</w:t>
+      </w:r>
+      <w:r>
+        <w:rPr>
+          <w:rFonts w:ascii="Times New Roman" w:eastAsiaTheme="minorEastAsia" w:hAnsi="Times New Roman" w:cs="Times New Roman"/>
+        </w:rPr>
+        <w:t>. This measures</w:t>
+      </w:r>
+      <w:r>
+        <w:rPr>
+          <w:rFonts w:ascii="Times New Roman" w:eastAsiaTheme="minorEastAsia" w:hAnsi="Times New Roman" w:cs="Times New Roman"/>
+        </w:rPr>
+        <w:t xml:space="preserve"> the </w:t>
+      </w:r>
+      <w:r>
+        <w:rPr>
+          <w:rFonts w:ascii="Times New Roman" w:eastAsiaTheme="minorEastAsia" w:hAnsi="Times New Roman" w:cs="Times New Roman"/>
+        </w:rPr>
+        <w:t xml:space="preserve">ATE without the districts that would have received a railroad regardless of military planning, </w:t>
+      </w:r>
+      <w:r>
+        <w:rPr>
+          <w:rFonts w:ascii="Times New Roman" w:eastAsiaTheme="minorEastAsia" w:hAnsi="Times New Roman" w:cs="Times New Roman"/>
+        </w:rPr>
+        <w:t>such as</w:t>
+      </w:r>
+      <w:r>
+        <w:rPr>
+          <w:rFonts w:ascii="Times New Roman" w:eastAsiaTheme="minorEastAsia" w:hAnsi="Times New Roman" w:cs="Times New Roman"/>
+        </w:rPr>
+        <w:t xml:space="preserve"> major economic hubs like Bombay or Calcutta. </w:t>
+      </w:r>
+      <w:r>
+        <w:rPr>
+          <w:rFonts w:ascii="Times New Roman" w:eastAsiaTheme="minorEastAsia" w:hAnsi="Times New Roman" w:cs="Times New Roman"/>
+        </w:rPr>
+        <w:t>Regardless of this distinction, the sufficient statistic result from Step 4 sheds further light on the mechanism behind the estimated effect. The trade mechanism alone accounts for approximately 52% of this effect, with the railroad access coefficient falling from 0.258 to 0.124 when the model-predicted trade share is included.</w:t>
+      </w:r>
+    </w:p>
+    <w:p>
+      <w:pPr>
+        <w:rPr>
+          <w:rFonts w:ascii="Times New Roman" w:eastAsiaTheme="minorEastAsia" w:hAnsi="Times New Roman" w:cs="Times New Roman"/>
+        </w:rPr>
+      </w:pPr>
+      <w:r>
+        <w:rPr>
+          <w:rFonts w:ascii="Times New Roman" w:eastAsiaTheme="minorEastAsia" w:hAnsi="Times New Roman" w:cs="Times New Roman"/>
+        </w:rPr>
+        <w:br w:type="page"/>
+      </w:r>
+    </w:p>
+    <w:p>
+      <w:pPr>
+        <w:pStyle w:val="Heading3"/>
+        <w:jc w:val="center"/>
+        <w:rPr>
+          <w:rFonts w:ascii="Times New Roman" w:eastAsiaTheme="minorEastAsia" w:hAnsi="Times New Roman" w:cs="Times New Roman"/>
+          <w:color w:val="auto"/>
+        </w:rPr>
+      </w:pPr>
+      <w:r>
+        <w:rPr>
+          <w:rFonts w:ascii="Times New Roman" w:eastAsiaTheme="minorEastAsia" w:hAnsi="Times New Roman" w:cs="Times New Roman"/>
+          <w:color w:val="auto"/>
+        </w:rPr>
+        <w:lastRenderedPageBreak/>
+        <w:t>Section III: Critique</w:t>
+      </w:r>
+    </w:p>
+    <w:p>
+      <w:pPr>
+        <w:ind w:firstLine="720"/>
+        <w:rPr>
+          <w:rFonts w:ascii="Times New Roman" w:hAnsi="Times New Roman" w:cs="Times New Roman"/>
+        </w:rPr>
+      </w:pPr>
+      <w:r>
+        <w:rPr>
+          <w:rFonts w:ascii="Times New Roman" w:hAnsi="Times New Roman" w:cs="Times New Roman"/>
+        </w:rPr>
+        <w:t>Donaldson's paper on the impact of railroads on trade and welfare in Colonial India is both theoretically grounded and empirically rigorous; however,</w:t>
+      </w:r>
+      <w:r>
+        <w:rPr>
+          <w:rFonts w:ascii="Times New Roman" w:hAnsi="Times New Roman" w:cs="Times New Roman"/>
+        </w:rPr>
+        <w:t xml:space="preserve"> it relies on assumptions worth examining.</w:t>
+      </w:r>
+      <w:r>
+        <w:rPr>
+          <w:rFonts w:ascii="Times New Roman" w:hAnsi="Times New Roman" w:cs="Times New Roman"/>
+        </w:rPr>
+        <w:t xml:space="preserve"> </w:t>
+      </w:r>
+      <w:r>
+        <w:rPr>
+          <w:rFonts w:ascii="Times New Roman" w:hAnsi="Times New Roman" w:cs="Times New Roman"/>
+        </w:rPr>
+        <w:t>These assumptions span both the theoretical foundations of the Ricardian trade model and the empirical steps that follow, from the functional form assumptions underlying the Fréchet distribution to the identification strategy in the reduced-form income regressions</w:t>
+      </w:r>
+      <w:r>
+        <w:rPr>
+          <w:rFonts w:ascii="Times New Roman" w:hAnsi="Times New Roman" w:cs="Times New Roman"/>
+        </w:rPr>
+        <w:t>.</w:t>
       </w:r>
     </w:p>
     <w:sectPr>

</xml_diff>